<commit_message>
feat: tambahkan butir 10-12 keterbatasan teknis Subbab 4.7 pada laporan
</commit_message>
<xml_diff>
--- a/uts-blockchain-submission/sumber/237006079_Fajar_Geran_Arifin_UTS_Blockchain_OBE.docx
+++ b/uts-blockchain-submission/sumber/237006079_Fajar_Geran_Arifin_UTS_Blockchain_OBE.docx
@@ -9339,6 +9339,42 @@
           <w:sz w:val="18"/>
         </w:rPr>
         <w:t>• 9. Desain Pencabutan revokeCredential: revokeCredential(leafHash, batchId, reason) hanya memeriksa bahwa batchId terdaftar dan belum memeriksa bahwa leafHash merupakan anggota Merkle root batch tersebut; pilihan ini menghemat gas pencabut karena tidak perlu mengirim Merkle proof. Keamanan verifikasi tidak bergantung pada pemeriksaan itu: verifyCredential tetap mewajibkan Merkle proof yang valid dan memeriksa status pencabutan. Konsekuensinya, pemegang REVOKER_ROLE dapat mencatat hash yang bukan anggota batch; dampaknya terbatas pada hash tersebut, tindakan itu tercatat pada event CredentialRevoked, dan penerbitan serta pencabutan dapat dihentikan melalui Pausable. Pemeriksaan keanggotaan leaf saat pencabutan menjadi pengembangan lanjutan.</w:t>
+      </w:r>
+    </w:p>
+    <w:p>
+      <w:pPr>
+        <w:spacing w:before="60" w:after="40"/>
+      </w:pPr>
+      <w:r>
+        <w:rPr>
+          <w:rFonts w:ascii="Arial" w:hAnsi="Arial"/>
+          <w:sz w:val="18"/>
+        </w:rPr>
+        <w:t>• 10. Pengungkapan Dokumen Penuh: Prototipe menghitung satu daun Merkle dari seluruh isi kredensial (computeCredentialLeaf), sehingga verifikator menerima seluruh isi dokumen dan salt. Selective disclosure per field (daun dan salt per field) dirancang sebagai pengembangan lanjutan dan belum diimplementasikan.</w:t>
+      </w:r>
+    </w:p>
+    <w:p>
+      <w:pPr>
+        <w:spacing w:before="60" w:after="40"/>
+      </w:pPr>
+      <w:r>
+        <w:rPr>
+          <w:rFonts w:ascii="Arial" w:hAnsi="Arial"/>
+          <w:sz w:val="18"/>
+        </w:rPr>
+        <w:t>• 11. Pembuktian Kepemilikan: Prototipe memverifikasi integritas dan penerbit, belum memverifikasi bahwa penyaji adalah pemegang sah. Tanda tangan pemegang dengan challenge dari verifikator (mis. Verifiable Presentation) baru berupa rancangan.</w:t>
+      </w:r>
+    </w:p>
+    <w:p>
+      <w:pPr>
+        <w:spacing w:before="60" w:after="40"/>
+      </w:pPr>
+      <w:r>
+        <w:rPr>
+          <w:rFonts w:ascii="Arial" w:hAnsi="Arial"/>
+          <w:sz w:val="18"/>
+        </w:rPr>
+        <w:t>• 12. Cakupan Jenis Kredensial: Prototipe menguji data ijazah. Sertifikat kompetensi dan transkrip dirancang memakai mekanisme yang sama dengan atribut berbeda (properti type pada W3C VC) dan belum diuji.</w:t>
       </w:r>
     </w:p>
     <w:p>

</xml_diff>